<commit_message>
Resultados de la evaluación e informe completo con análisis del LLM
</commit_message>
<xml_diff>
--- a/informe/informe.docx
+++ b/informe/informe.docx
@@ -2116,9 +2116,8 @@
             <w:r>
               <w:rPr>
                 <w:sz w:val="19"/>
-                <w:highlight w:val="yellow"/>
-              </w:rPr>
-              <w:t xml:space="preserve">[COMPLETAR]</w:t>
+              </w:rPr>
+              <w:t>Se cultivan las cepas cabernet sauvignon, carmenere, syrah y malbec en el valle de Colchagua.</w:t>
             </w:r>
           </w:p>
         </w:tc>
@@ -2179,9 +2178,8 @@
             <w:r>
               <w:rPr>
                 <w:sz w:val="19"/>
-                <w:highlight w:val="yellow"/>
-              </w:rPr>
-              <w:t xml:space="preserve">[COMPLETAR]</w:t>
+              </w:rPr>
+              <w:t>El Carménère se produce en los valles de Aconcagua y Maipo.</w:t>
             </w:r>
           </w:p>
         </w:tc>
@@ -2242,9 +2240,8 @@
             <w:r>
               <w:rPr>
                 <w:sz w:val="19"/>
-                <w:highlight w:val="yellow"/>
-              </w:rPr>
-              <w:t xml:space="preserve">[COMPLETAR]</w:t>
+              </w:rPr>
+              <w:t>La cepa País proviene de España.</w:t>
             </w:r>
           </w:p>
         </w:tc>
@@ -2305,9 +2302,8 @@
             <w:r>
               <w:rPr>
                 <w:sz w:val="19"/>
-                <w:highlight w:val="yellow"/>
-              </w:rPr>
-              <w:t xml:space="preserve">[COMPLETAR]</w:t>
+              </w:rPr>
+              <w:t>Te recomiendo un Sauvignon Blanc para acompañar tu ceviche. Este vino tiene notas de cítricos y pasto recién cortado que complementan bien el sabor del pescado y los limones en el ceviche.</w:t>
             </w:r>
           </w:p>
         </w:tc>
@@ -2368,9 +2364,8 @@
             <w:r>
               <w:rPr>
                 <w:sz w:val="19"/>
-                <w:highlight w:val="yellow"/>
-              </w:rPr>
-              <w:t xml:space="preserve">[COMPLETAR]</w:t>
+              </w:rPr>
+              <w:t>El Sauvignon Blanc tiene notas aromáticas de cítricos, pasto recién cortado y maracuyá.</w:t>
             </w:r>
           </w:p>
         </w:tc>
@@ -2431,9 +2426,8 @@
             <w:r>
               <w:rPr>
                 <w:sz w:val="19"/>
-                <w:highlight w:val="yellow"/>
-              </w:rPr>
-              <w:t xml:space="preserve">[COMPLETAR]</w:t>
+              </w:rPr>
+              <w:t>El valle de Casablanca tiene un clima costero fresco.</w:t>
             </w:r>
           </w:p>
         </w:tc>
@@ -2494,9 +2488,8 @@
             <w:r>
               <w:rPr>
                 <w:sz w:val="19"/>
-                <w:highlight w:val="yellow"/>
-              </w:rPr>
-              <w:t xml:space="preserve">[COMPLETAR]</w:t>
+              </w:rPr>
+              <w:t>El valle del Maipo está en la región administrativa de Metropolitana.</w:t>
             </w:r>
           </w:p>
         </w:tc>
@@ -2557,9 +2550,8 @@
             <w:r>
               <w:rPr>
                 <w:sz w:val="19"/>
-                <w:highlight w:val="yellow"/>
-              </w:rPr>
-              <w:t xml:space="preserve">[COMPLETAR]</w:t>
+              </w:rPr>
+              <w:t>No, el valle de Leyda no cultiva Pinot Noir. Sin embargo, sí cultiva Chardonnay y Pinot Noir en el valle de Casablanca.</w:t>
             </w:r>
           </w:p>
         </w:tc>
@@ -2620,9 +2612,8 @@
             <w:r>
               <w:rPr>
                 <w:sz w:val="19"/>
-                <w:highlight w:val="yellow"/>
-              </w:rPr>
-              <w:t xml:space="preserve">[COMPLETAR]</w:t>
+              </w:rPr>
+              <w:t>No tengo esa información en mi base de conocimiento.</w:t>
             </w:r>
           </w:p>
         </w:tc>
@@ -2683,9 +2674,8 @@
             <w:r>
               <w:rPr>
                 <w:sz w:val="19"/>
-                <w:highlight w:val="yellow"/>
-              </w:rPr>
-              <w:t xml:space="preserve">[COMPLETAR]</w:t>
+              </w:rPr>
+              <w:t>La cepa emblemática de Chile es el Carmenere.</w:t>
             </w:r>
           </w:p>
         </w:tc>
@@ -2746,9 +2736,8 @@
             <w:r>
               <w:rPr>
                 <w:sz w:val="19"/>
-                <w:highlight w:val="yellow"/>
-              </w:rPr>
-              <w:t xml:space="preserve">[COMPLETAR]</w:t>
+              </w:rPr>
+              <w:t>Las cepas que comparten tanto el Valle de Maipo como el Valle de Colchagua son: cabernet sauvignon, carmenere y syrah.</w:t>
             </w:r>
           </w:p>
         </w:tc>
@@ -2809,9 +2798,8 @@
             <w:r>
               <w:rPr>
                 <w:sz w:val="19"/>
-                <w:highlight w:val="yellow"/>
-              </w:rPr>
-              <w:t xml:space="preserve">[COMPLETAR]</w:t>
+              </w:rPr>
+              <w:t>La temperatura de servicio para un Syrah es de 16 a 18 grados Celsius.</w:t>
             </w:r>
           </w:p>
         </w:tc>
@@ -2872,9 +2860,8 @@
             <w:r>
               <w:rPr>
                 <w:sz w:val="19"/>
-                <w:highlight w:val="yellow"/>
-              </w:rPr>
-              <w:t xml:space="preserve">[COMPLETAR]</w:t>
+              </w:rPr>
+              <w:t>Los valles que pertenecen a la zona sur son el valle de Itata y el valle de Biobío.</w:t>
             </w:r>
           </w:p>
         </w:tc>
@@ -2935,9 +2922,8 @@
             <w:r>
               <w:rPr>
                 <w:sz w:val="19"/>
-                <w:highlight w:val="yellow"/>
-              </w:rPr>
-              <w:t xml:space="preserve">[COMPLETAR]</w:t>
+              </w:rPr>
+              <w:t>Las cepas de origen francés son cabernet_sauvignon, carmenere, merlot, syrah y pinot_noir.</w:t>
             </w:r>
           </w:p>
         </w:tc>
@@ -2998,9 +2984,8 @@
             <w:r>
               <w:rPr>
                 <w:sz w:val="19"/>
-                <w:highlight w:val="yellow"/>
-              </w:rPr>
-              <w:t xml:space="preserve">[COMPLETAR]</w:t>
+              </w:rPr>
+              <w:t>Las cepas que se dan en valles de clima frío son: Carignan, Cinsault y Moscatel de Alejandría. Estas cepas se cultivan en valles como Elqui, Limari y Itata, que tienen climas fríos o frescos.</w:t>
             </w:r>
           </w:p>
         </w:tc>
@@ -3061,9 +3046,8 @@
             <w:r>
               <w:rPr>
                 <w:sz w:val="19"/>
-                <w:highlight w:val="yellow"/>
-              </w:rPr>
-              <w:t xml:space="preserve">[COMPLETAR]</w:t>
+              </w:rPr>
+              <w:t>Te recomiendo el Pinot Noir, que es una cepa tinta con cuerpo ligero y se adapta bien para disfrutar en diferentes ocasiones.</w:t>
             </w:r>
           </w:p>
         </w:tc>
@@ -3124,9 +3108,8 @@
             <w:r>
               <w:rPr>
                 <w:sz w:val="19"/>
-                <w:highlight w:val="yellow"/>
-              </w:rPr>
-              <w:t xml:space="preserve">[COMPLETAR]</w:t>
+              </w:rPr>
+              <w:t>El Carménère y el Merlot son dos cepas de uva distintas, aunque ambos producen vinos tintos. El Carménère es originario de Francia pero se cree que es una mutación del Merlot. En Chile, el Carménère se ha convertido en una cepa emblemática y se le atribuyen características únicas como un sabor más intenso y notas de pimienta y pimentón rojo. Por otro lado, el Merlot es conocido por su sabor suave y notas de frutas rojas como ciruela y cereza. Ambos vinos se pueden servir a una temperatura entre 16 y 18 grados Celsius.</w:t>
             </w:r>
           </w:p>
         </w:tc>
@@ -3187,9 +3170,8 @@
             <w:r>
               <w:rPr>
                 <w:sz w:val="19"/>
-                <w:highlight w:val="yellow"/>
-              </w:rPr>
-              <w:t xml:space="preserve">[COMPLETAR]</w:t>
+              </w:rPr>
+              <w:t>No, el Cabernet Sauvignon no va con sushi. Se recomienda más para carnes rojas y quesos maduros. Para sushi, se podría optar por un Sauvignon Blanc o un Riesling.</w:t>
             </w:r>
           </w:p>
         </w:tc>
@@ -3250,9 +3232,8 @@
             <w:r>
               <w:rPr>
                 <w:sz w:val="19"/>
-                <w:highlight w:val="yellow"/>
-              </w:rPr>
-              <w:t xml:space="preserve">[COMPLETAR]</w:t>
+              </w:rPr>
+              <w:t>El valle de aconcagua produce carménère.</w:t>
             </w:r>
           </w:p>
         </w:tc>
@@ -3313,9 +3294,8 @@
             <w:r>
               <w:rPr>
                 <w:sz w:val="19"/>
-                <w:highlight w:val="yellow"/>
-              </w:rPr>
-              <w:t xml:space="preserve">[COMPLETAR]</w:t>
+              </w:rPr>
+              <w:t>No tengo esa información en mi base de conocimiento.</w:t>
             </w:r>
           </w:p>
         </w:tc>
@@ -3554,11 +3534,8 @@
               <w:jc w:val="left"/>
             </w:pPr>
             <w:r>
-              <w:rPr>
-                <w:sz w:val="19"/>
-                <w:highlight w:val="yellow"/>
-              </w:rPr>
-              <w:t xml:space="preserve">[COMPLETAR]</w:t>
+              <w:rPr/>
+              <w:t>Correcta</w:t>
             </w:r>
           </w:p>
         </w:tc>
@@ -3617,11 +3594,8 @@
               <w:jc w:val="left"/>
             </w:pPr>
             <w:r>
-              <w:rPr>
-                <w:sz w:val="19"/>
-                <w:highlight w:val="yellow"/>
-              </w:rPr>
-              <w:t xml:space="preserve">[COMPLETAR]</w:t>
+              <w:rPr/>
+              <w:t>Parcial</w:t>
             </w:r>
           </w:p>
         </w:tc>
@@ -3710,11 +3684,8 @@
               <w:jc w:val="left"/>
             </w:pPr>
             <w:r>
-              <w:rPr>
-                <w:sz w:val="19"/>
-                <w:highlight w:val="yellow"/>
-              </w:rPr>
-              <w:t xml:space="preserve">[COMPLETAR]</w:t>
+              <w:rPr/>
+              <w:t>Correcta</w:t>
             </w:r>
           </w:p>
         </w:tc>
@@ -3773,11 +3744,8 @@
               <w:jc w:val="left"/>
             </w:pPr>
             <w:r>
-              <w:rPr>
-                <w:sz w:val="19"/>
-                <w:highlight w:val="yellow"/>
-              </w:rPr>
-              <w:t xml:space="preserve">[COMPLETAR]</w:t>
+              <w:rPr/>
+              <w:t>Correcta</w:t>
             </w:r>
           </w:p>
         </w:tc>
@@ -3836,11 +3804,8 @@
               <w:jc w:val="left"/>
             </w:pPr>
             <w:r>
-              <w:rPr>
-                <w:sz w:val="19"/>
-                <w:highlight w:val="yellow"/>
-              </w:rPr>
-              <w:t xml:space="preserve">[COMPLETAR]</w:t>
+              <w:rPr/>
+              <w:t>Correcta</w:t>
             </w:r>
           </w:p>
         </w:tc>
@@ -3899,11 +3864,8 @@
               <w:jc w:val="left"/>
             </w:pPr>
             <w:r>
-              <w:rPr>
-                <w:sz w:val="19"/>
-                <w:highlight w:val="yellow"/>
-              </w:rPr>
-              <w:t xml:space="preserve">[COMPLETAR]</w:t>
+              <w:rPr/>
+              <w:t>Correcta</w:t>
             </w:r>
           </w:p>
         </w:tc>
@@ -3962,11 +3924,8 @@
               <w:jc w:val="left"/>
             </w:pPr>
             <w:r>
-              <w:rPr>
-                <w:sz w:val="19"/>
-                <w:highlight w:val="yellow"/>
-              </w:rPr>
-              <w:t xml:space="preserve">[COMPLETAR]</w:t>
+              <w:rPr/>
+              <w:t>Correcta</w:t>
             </w:r>
           </w:p>
         </w:tc>
@@ -4025,11 +3984,8 @@
               <w:jc w:val="left"/>
             </w:pPr>
             <w:r>
-              <w:rPr>
-                <w:sz w:val="19"/>
-                <w:highlight w:val="yellow"/>
-              </w:rPr>
-              <w:t xml:space="preserve">[COMPLETAR]</w:t>
+              <w:rPr/>
+              <w:t>Incorrecta</w:t>
             </w:r>
           </w:p>
         </w:tc>
@@ -4088,11 +4044,8 @@
               <w:jc w:val="left"/>
             </w:pPr>
             <w:r>
-              <w:rPr>
-                <w:sz w:val="19"/>
-                <w:highlight w:val="yellow"/>
-              </w:rPr>
-              <w:t xml:space="preserve">[COMPLETAR]</w:t>
+              <w:rPr/>
+              <w:t>Correcta</w:t>
             </w:r>
           </w:p>
         </w:tc>
@@ -4151,11 +4104,8 @@
               <w:jc w:val="left"/>
             </w:pPr>
             <w:r>
-              <w:rPr>
-                <w:sz w:val="19"/>
-                <w:highlight w:val="yellow"/>
-              </w:rPr>
-              <w:t xml:space="preserve">[COMPLETAR]</w:t>
+              <w:rPr/>
+              <w:t>Correcta</w:t>
             </w:r>
           </w:p>
         </w:tc>
@@ -4214,11 +4164,8 @@
               <w:jc w:val="left"/>
             </w:pPr>
             <w:r>
-              <w:rPr>
-                <w:sz w:val="19"/>
-                <w:highlight w:val="yellow"/>
-              </w:rPr>
-              <w:t xml:space="preserve">[COMPLETAR]</w:t>
+              <w:rPr/>
+              <w:t>Incorrecta</w:t>
             </w:r>
           </w:p>
         </w:tc>
@@ -4277,11 +4224,8 @@
               <w:jc w:val="left"/>
             </w:pPr>
             <w:r>
-              <w:rPr>
-                <w:sz w:val="19"/>
-                <w:highlight w:val="yellow"/>
-              </w:rPr>
-              <w:t xml:space="preserve">[COMPLETAR]</w:t>
+              <w:rPr/>
+              <w:t>Correcta</w:t>
             </w:r>
           </w:p>
         </w:tc>
@@ -4340,11 +4284,8 @@
               <w:jc w:val="left"/>
             </w:pPr>
             <w:r>
-              <w:rPr>
-                <w:sz w:val="19"/>
-                <w:highlight w:val="yellow"/>
-              </w:rPr>
-              <w:t xml:space="preserve">[COMPLETAR]</w:t>
+              <w:rPr/>
+              <w:t>Parcial</w:t>
             </w:r>
           </w:p>
         </w:tc>
@@ -4427,11 +4368,8 @@
               <w:jc w:val="left"/>
             </w:pPr>
             <w:r>
-              <w:rPr>
-                <w:sz w:val="19"/>
-                <w:highlight w:val="yellow"/>
-              </w:rPr>
-              <w:t xml:space="preserve">[COMPLETAR]</w:t>
+              <w:rPr/>
+              <w:t>Parcial</w:t>
             </w:r>
           </w:p>
         </w:tc>
@@ -4490,11 +4428,8 @@
               <w:jc w:val="left"/>
             </w:pPr>
             <w:r>
-              <w:rPr>
-                <w:sz w:val="19"/>
-                <w:highlight w:val="yellow"/>
-              </w:rPr>
-              <w:t xml:space="preserve">[COMPLETAR]</w:t>
+              <w:rPr/>
+              <w:t>Incorrecta</w:t>
             </w:r>
           </w:p>
         </w:tc>
@@ -4553,11 +4488,8 @@
               <w:jc w:val="left"/>
             </w:pPr>
             <w:r>
-              <w:rPr>
-                <w:sz w:val="19"/>
-                <w:highlight w:val="yellow"/>
-              </w:rPr>
-              <w:t xml:space="preserve">[COMPLETAR]</w:t>
+              <w:rPr/>
+              <w:t>Correcta</w:t>
             </w:r>
           </w:p>
         </w:tc>
@@ -4616,11 +4548,8 @@
               <w:jc w:val="left"/>
             </w:pPr>
             <w:r>
-              <w:rPr>
-                <w:sz w:val="19"/>
-                <w:highlight w:val="yellow"/>
-              </w:rPr>
-              <w:t xml:space="preserve">[COMPLETAR]</w:t>
+              <w:rPr/>
+              <w:t>Incorrecta</w:t>
             </w:r>
           </w:p>
         </w:tc>
@@ -4679,11 +4608,8 @@
               <w:jc w:val="left"/>
             </w:pPr>
             <w:r>
-              <w:rPr>
-                <w:sz w:val="19"/>
-                <w:highlight w:val="yellow"/>
-              </w:rPr>
-              <w:t xml:space="preserve">[COMPLETAR]</w:t>
+              <w:rPr/>
+              <w:t>Parcial</w:t>
             </w:r>
           </w:p>
         </w:tc>
@@ -4742,11 +4668,8 @@
               <w:jc w:val="left"/>
             </w:pPr>
             <w:r>
-              <w:rPr>
-                <w:sz w:val="19"/>
-                <w:highlight w:val="yellow"/>
-              </w:rPr>
-              <w:t xml:space="preserve">[COMPLETAR]</w:t>
+              <w:rPr/>
+              <w:t>Parcial</w:t>
             </w:r>
           </w:p>
         </w:tc>
@@ -4805,11 +4728,8 @@
               <w:jc w:val="left"/>
             </w:pPr>
             <w:r>
-              <w:rPr>
-                <w:sz w:val="19"/>
-                <w:highlight w:val="yellow"/>
-              </w:rPr>
-              <w:t xml:space="preserve">[COMPLETAR]</w:t>
+              <w:rPr/>
+              <w:t>Correcta</w:t>
             </w:r>
           </w:p>
         </w:tc>
@@ -4866,12 +4786,9 @@
             </w:pPr>
             <w:r>
               <w:rPr>
-                <w:bCs/>
                 <w:b/>
-                <w:sz w:val="19"/>
-                <w:highlight w:val="yellow"/>
-              </w:rPr>
-              <w:t xml:space="preserve">[COMPLETAR]</w:t>
+              </w:rPr>
+              <w:t>11 / 20 (55 %)</w:t>
             </w:r>
           </w:p>
         </w:tc>
@@ -4883,31 +4800,13 @@
       </w:pPr>
       <w:r>
         <w:rPr>
-          <w:bCs/>
           <w:b/>
         </w:rPr>
-        <w:t xml:space="preserve">Tiempo de respuesta.</w:t>
-      </w:r>
-      <w:r>
-        <w:t xml:space="preserve"> </w:t>
-      </w:r>
-      <w:r>
-        <w:rPr>
-          <w:highlight w:val="yellow"/>
-        </w:rPr>
-        <w:t xml:space="preserve">Prolog responde en torno a 0,05 s por pregunta (medido por el sistema). LLM: [COMPLETAR con el tiempo promedio de</w:t>
-      </w:r>
-      <w:r>
-        <w:t xml:space="preserve"> </w:t>
-      </w:r>
-      <w:r>
-        <w:rPr>
-          <w:rStyle w:val="VerbatimChar"/>
-        </w:rPr>
-        <w:t xml:space="preserve">resultados.json</w:t>
-      </w:r>
-      <w:r>
-        <w:t xml:space="preserve">].</w:t>
+        <w:t>Tiempo de respuesta.</w:t>
+      </w:r>
+      <w:r>
+        <w:rPr/>
+        <w:t xml:space="preserve"> En promedio, Prolog respondió en 0,14 s por pregunta (rango 0,07 a 0,18 s) y el LLM en 4,25 s (rango 2,93 a 10,53 s), es decir, unas 30 veces más lento. El tiempo de Prolog incluye iniciar SWI-Prolog en cada consulta; el del LLM se midió con el modelo ya cargado en memoria (la primera consulta con el modelo en frío tardó cerca de 58 s).</w:t>
       </w:r>
     </w:p>
     <w:bookmarkEnd w:id="32"/>
@@ -5062,28 +4961,206 @@
         <w:pStyle w:val="FirstParagraph"/>
       </w:pPr>
       <w:r>
-        <w:rPr>
-          <w:highlight w:val="yellow"/>
-        </w:rPr>
-        <w:t xml:space="preserve">[COMPLETAR tras ejecutar la evaluación. Puntos a revisar en las respuestas: si en la 19 reconoce</w:t>
-      </w:r>
-      <w:r>
-        <w:t xml:space="preserve"> </w:t>
-      </w:r>
-      <w:r>
-        <w:t xml:space="preserve">“</w:t>
-      </w:r>
-      <w:r>
-        <w:t xml:space="preserve">carmener</w:t>
-      </w:r>
-      <w:r>
-        <w:t xml:space="preserve">”</w:t>
-      </w:r>
-      <w:r>
-        <w:t xml:space="preserve"> </w:t>
-      </w:r>
-      <w:r>
-        <w:t xml:space="preserve">como Carménère; si en la 9 y la 20 declara que no tiene la información o agrega datos externos (alucinación); si en la 15 llega a la misma lista que Prolog al aplicar la regla de clima frío; y si en la 17 sintetiza la diferencia.]</w:t>
+        <w:rPr/>
+        <w:t>El chatbot LLM obtuvo 11 respuestas correctas, 5 parciales y 4 incorrectas (55 %), frente a las 17 correctas de Prolog (85 %). Sus aciertos y errores son de naturaleza distinta a los de Prolog.</w:t>
+      </w:r>
+    </w:p>
+    <w:p>
+      <w:pPr>
+        <w:pStyle w:val="BodyText"/>
+      </w:pPr>
+      <w:r>
+        <w:rPr/>
+        <w:t>Fortalezas observadas:</w:t>
+      </w:r>
+    </w:p>
+    <w:p>
+      <w:pPr>
+        <w:numPr>
+          <w:ilvl w:val="0"/>
+          <w:numId w:val="1003"/>
+        </w:numPr>
+        <w:pStyle w:val="Compact"/>
+      </w:pPr>
+      <w:r>
+        <w:rPr>
+          <w:b/>
+        </w:rPr>
+        <w:t>Reconoce cuándo no tiene la información.</w:t>
+      </w:r>
+      <w:r>
+        <w:rPr/>
+        <w:t xml:space="preserve"> En las preguntas 9 y 20 respondió que no estaba en su base, que es la respuesta correcta. Prolog falló en la 9 porque interpretó una pregunta de “por qué” como una comparación.</w:t>
+      </w:r>
+    </w:p>
+    <w:p>
+      <w:pPr>
+        <w:numPr>
+          <w:ilvl w:val="0"/>
+          <w:numId w:val="1003"/>
+        </w:numPr>
+        <w:pStyle w:val="Compact"/>
+      </w:pPr>
+      <w:r>
+        <w:rPr>
+          <w:b/>
+        </w:rPr>
+        <w:t>Interpreta preguntas fuera de los patrones programados.</w:t>
+      </w:r>
+      <w:r>
+        <w:rPr/>
+        <w:t xml:space="preserve"> En la 19 entendió que “carmener” era Carménère, algo que Prolog no logró, aunque su respuesta quedó incompleta.</w:t>
+      </w:r>
+    </w:p>
+    <w:p>
+      <w:pPr>
+        <w:numPr>
+          <w:ilvl w:val="0"/>
+          <w:numId w:val="1003"/>
+        </w:numPr>
+        <w:pStyle w:val="Compact"/>
+      </w:pPr>
+      <w:r>
+        <w:rPr>
+          <w:b/>
+        </w:rPr>
+        <w:t>Iguala a Prolog en consultas directas.</w:t>
+      </w:r>
+      <w:r>
+        <w:rPr/>
+        <w:t xml:space="preserve"> Respondió correctamente los hechos de una sola relación (preguntas 1, 3, 5, 6, 7, 10 y 12) con redacción natural, y ofreció una alternativa útil en la 18 (Riesling).</w:t>
+      </w:r>
+    </w:p>
+    <w:p>
+      <w:pPr>
+        <w:pStyle w:val="BodyText"/>
+      </w:pPr>
+      <w:r>
+        <w:rPr/>
+        <w:t>Debilidades observadas:</w:t>
+      </w:r>
+    </w:p>
+    <w:p>
+      <w:pPr>
+        <w:numPr>
+          <w:ilvl w:val="0"/>
+          <w:numId w:val="1003"/>
+        </w:numPr>
+        <w:pStyle w:val="Compact"/>
+      </w:pPr>
+      <w:r>
+        <w:rPr>
+          <w:b/>
+        </w:rPr>
+        <w:t>Respuestas incompletas (2, 13, 14 y 19).</w:t>
+      </w:r>
+      <w:r>
+        <w:rPr/>
+        <w:t xml:space="preserve"> Omite elementos que sí están en la base: Carménère solo en 2 de sus 4 valles (2 y 19), la zona sur sin Malleco (13) y 5 de las 9 cepas de origen francés (14).</w:t>
+      </w:r>
+    </w:p>
+    <w:p>
+      <w:pPr>
+        <w:numPr>
+          <w:ilvl w:val="0"/>
+          <w:numId w:val="1003"/>
+        </w:numPr>
+        <w:pStyle w:val="Compact"/>
+      </w:pPr>
+      <w:r>
+        <w:rPr>
+          <w:b/>
+        </w:rPr>
+        <w:t>Información que contradice la base (8 y 11).</w:t>
+      </w:r>
+      <w:r>
+        <w:rPr/>
+        <w:t xml:space="preserve"> Dijo que el Pinot Noir no se cultiva en Leyda, siendo un hecho explícito, y agregó Syrah a las cepas que comparten Maipo y Colchagua, aunque Maipo no la cultiva.</w:t>
+      </w:r>
+    </w:p>
+    <w:p>
+      <w:pPr>
+        <w:numPr>
+          <w:ilvl w:val="0"/>
+          <w:numId w:val="1003"/>
+        </w:numPr>
+        <w:pStyle w:val="Compact"/>
+      </w:pPr>
+      <w:r>
+        <w:rPr>
+          <w:b/>
+        </w:rPr>
+        <w:t>Falla al aplicar reglas de inferencia (15).</w:t>
+      </w:r>
+      <w:r>
+        <w:rPr/>
+        <w:t xml:space="preserve"> Listó Carignan, Cinsault y Moscatel de Alejandría y citó Elqui y Limarí como valles fríos, siendo ambos semiáridos. No encadenó valle → clima → clima frío, que Prolog resuelve de forma exacta.</w:t>
+      </w:r>
+    </w:p>
+    <w:p>
+      <w:pPr>
+        <w:numPr>
+          <w:ilvl w:val="0"/>
+          <w:numId w:val="1003"/>
+        </w:numPr>
+        <w:pStyle w:val="Compact"/>
+      </w:pPr>
+      <w:r>
+        <w:rPr>
+          <w:b/>
+        </w:rPr>
+        <w:t>Incorpora conocimiento externo (17 y 18).</w:t>
+      </w:r>
+      <w:r>
+        <w:rPr/>
+        <w:t xml:space="preserve"> En la 17 afirmó que el Carménère se cree una mutación del Merlot y le atribuyó notas de pimienta, datos ausentes de la base, y no mencionó que ambas cepas son de cuerpo medio. En la 18 sugirió Sauvignon Blanc para sushi, maridaje que la base no registra.</w:t>
+      </w:r>
+    </w:p>
+    <w:p>
+      <w:pPr>
+        <w:numPr>
+          <w:ilvl w:val="0"/>
+          <w:numId w:val="1003"/>
+        </w:numPr>
+        <w:pStyle w:val="Compact"/>
+      </w:pPr>
+      <w:r>
+        <w:rPr>
+          <w:b/>
+        </w:rPr>
+        <w:t>Formato poco cuidado.</w:t>
+      </w:r>
+      <w:r>
+        <w:rPr/>
+        <w:t xml:space="preserve"> A veces devuelve nombres sin tildes o como átomos de Prolog (“cabernet_sauvignon” en la 14), y el estilo varía entre respuestas.</w:t>
+      </w:r>
+    </w:p>
+    <w:p>
+      <w:pPr>
+        <w:numPr>
+          <w:ilvl w:val="0"/>
+          <w:numId w:val="1003"/>
+        </w:numPr>
+        <w:pStyle w:val="Compact"/>
+      </w:pPr>
+      <w:r>
+        <w:rPr>
+          <w:b/>
+        </w:rPr>
+        <w:t>Más lento.</w:t>
+      </w:r>
+      <w:r>
+        <w:rPr/>
+        <w:t xml:space="preserve"> 4,25 s promedio frente a 0,14 s de Prolog.</w:t>
+      </w:r>
+    </w:p>
+    <w:p>
+      <w:pPr>
+        <w:pStyle w:val="BodyText"/>
+      </w:pPr>
+      <w:r>
+        <w:rPr/>
+        <w:t>Estos errores ocurren aunque el LLM recibe la base completa y la instrucción de usar solo esa información. Los fallos de exhaustividad (2, 13, 14 y 19) y de conjuntos e inferencia (11 y 15) indican que un modelo local de 7.000 millones de parámetros no ejecuta de forma confiable operaciones lógicas sobre unos 170 hechos, algo trivial para Prolog. Además, cada enfoque falla en preguntas distintas (Prolog: 9, 17 y 19; LLM: 8, 11, 15 y 17), por lo que son complementarios.</w:t>
       </w:r>
     </w:p>
     <w:bookmarkEnd w:id="34"/>
@@ -5280,10 +5357,8 @@
         <w:pStyle w:val="FirstParagraph"/>
       </w:pPr>
       <w:r>
-        <w:rPr>
-          <w:highlight w:val="yellow"/>
-        </w:rPr>
-        <w:t xml:space="preserve">[Revisar y completar con los resultados del LLM.]</w:t>
+        <w:rPr/>
+        <w:t>Se implementó y comparó un chatbot sobre vinos y cepas de Chile con dos enfoques que comparten una misma base de conocimiento: lógica de primer orden en Prolog y un LLM local (Qwen 2.5 de 7B).</w:t>
       </w:r>
     </w:p>
     <w:p>
@@ -5299,7 +5374,8 @@
         <w:pStyle w:val="BodyText"/>
       </w:pPr>
       <w:r>
-        <w:t xml:space="preserve">El enfoque con LLM complementa esa debilidad, ya que interpreta preguntas formuladas con libertad, pero sacrifica garantías: sus respuestas no son verificables paso a paso y pueden contener información que no está en la base. Compartir una única base de conocimiento entre ambas versiones permitió compararlas en igualdad de condiciones y mantener el conocimiento en un solo lugar.</w:t>
+        <w:rPr/>
+        <w:t>El LLM respondió correctamente 11 de 20 preguntas (55 %). Interpretó mejor las preguntas formuladas con libertad (9 y 19) y reconoció cuándo la base no tenía la información, pero entregó listas incompletas, contradijo un hecho explícito (8), falló al aplicar reglas (11 y 15) e incorporó datos externos (17). Sus respuestas no son verificables paso a paso y tardó unas 30 veces más que Prolog. Compartir una única base de conocimiento permitió compararlos en igualdad de condiciones. Para un dominio con conocimiento estructurado y respuestas que deben ser exactas, Prolog es más confiable; el LLM aporta flexibilidad con el lenguaje. Como los errores de cada enfoque son distintos, el resultado respalda una arquitectura híbrida.</w:t>
       </w:r>
     </w:p>
     <w:bookmarkEnd w:id="37"/>
@@ -5506,6 +5582,9 @@
       </w:r>
       <w:r>
         <w:t xml:space="preserve">), y que Prolog calcule la respuesta. Combina la flexibilidad del lenguaje natural con respuestas exactas y explicables.</w:t>
+      </w:r>
+      <w:r>
+        <w:t xml:space="preserve"> Los resultados lo respaldan: el LLM falló justo en consultas que Prolog resuelve de forma exacta (8, 11 y 15), y Prolog falló donde el LLM interpretó bien la pregunta (9 y 19).</w:t>
       </w:r>
     </w:p>
     <w:p>

</xml_diff>

<commit_message>
Informe: nota sobre mejoras posteriores a la evaluación (Prolog)
</commit_message>
<xml_diff>
--- a/informe/informe.docx
+++ b/informe/informe.docx
@@ -4944,6 +4944,20 @@
       </w:r>
       <w:r>
         <w:t xml:space="preserve">no coincide con ningún patrón, por lo que no reconoce la cepa y cae en una intención genérica que lista todos los valles.</w:t>
+      </w:r>
+    </w:p>
+    <w:p>
+      <w:pPr>
+        <w:pStyle w:val="BodyText"/>
+      </w:pPr>
+      <w:r>
+        <w:rPr>
+          <w:b/>
+        </w:rPr>
+        <w:t>Mejoras posteriores a la evaluación.</w:t>
+      </w:r>
+      <w:r>
+        <w:t xml:space="preserve"> Tras el análisis se corrigieron tres limitaciones adicionales del chatbot Prolog: el adjetivo “español” no se reconocía como origen, no existían intenciones para regiones administrativas (la regla cepa_en_region no se usaba) y las preguntas por cepas de una zona respondían con valles. Las respuestas a las 20 preguntas del informe no cambian, y se agregaron 7 pruebas automáticas.</w:t>
       </w:r>
     </w:p>
     <w:bookmarkEnd w:id="33"/>

</xml_diff>

<commit_message>
Informe: actualiza tiempos con la reevaluación y corrige formato
</commit_message>
<xml_diff>
--- a/informe/informe.docx
+++ b/informe/informe.docx
@@ -4455,7 +4455,7 @@
         <w:t>Tiempo de respuesta.</w:t>
       </w:r>
       <w:r>
-        <w:t xml:space="preserve"> En promedio, Prolog respondió en 0,14 s por pregunta (rango 0,07 a 0,18 s) y el LLM en 4,25 s (rango 2,93 a 10,53 s), es decir, unas 30 veces más lento. El tiempo de Prolog incluye iniciar SWI-Prolog en cada consulta; el del LLM se midió con el modelo ya cargado en memoria (la primera consulta con el modelo en frío tardó cerca de 58 s).</w:t>
+        <w:t xml:space="preserve"> En promedio, Prolog respondió en 0,15 s por pregunta (rango 0,06 a 0,20 s) y el LLM en 4,54 s (rango 2,93 a 10,50 s), es decir, unas 30 veces más lento. El tiempo de Prolog incluye iniciar SWI-Prolog en cada consulta; en el LLM, la primera consulta tardó 9,75 s por incluir la carga inicial del modelo, y el resto se midió con el modelo ya cargado en memoria.</w:t>
       </w:r>
     </w:p>
     <w:p>
@@ -4749,7 +4749,7 @@
         <w:t>Más lento.</w:t>
       </w:r>
       <w:r>
-        <w:t xml:space="preserve"> 4,25 s promedio frente a 0,14 s de Prolog.</w:t>
+        <w:t xml:space="preserve"> 4,54 s promedio frente a 0,15 s de Prolog.</w:t>
       </w:r>
     </w:p>
     <w:p>

</xml_diff>